<commit_message>
readiness brief Part B: each body's public data interface (page four and its slide)
reports/diagnostic/brief/api_terms.yaml: 19 rows (16 bodies, 3 reference hosts), every term
with a .gov URL and verbatim passage, 'not stated', or 'not determined' where the agency's own
site refused the fetch (BTS, ORES: HTTP 403). Desk research by WebSearch + WebFetch to .gov
hosts only; labelled as such in the brief. scripts/api_terms_check.py assembles, checks
(exits non-zero on an unsourced term; BLS must state both API versions) and tabulates.
Brief rebuilt: docx 4 pages, pptx 7 slides, all checks pass. DataFile be5253bc.

Co-Authored-By: Claude Opus 5.5 <noreply@anthropic.com>
</commit_message>
<xml_diff>
--- a/reports/diagnostic/brief/READINESS_BRIEF.docx
+++ b/reports/diagnostic/brief/READINESS_BRIEF.docx
@@ -4217,9 +4217,2499 @@
         <w:t>(d) Reference hosts are checked at the site level only, so this page-level check is not run on them.</w:t>
       </w:r>
     </w:p>
+    <w:p>
+      <w:pPr>
+        <w:sectPr>
+          <w:pgSz w:w="12240" w:h="15840"/>
+          <w:pgMar w:top="864" w:right="936" w:bottom="864" w:left="936" w:header="720" w:footer="720" w:gutter="0"/>
+          <w:cols w:space="720"/>
+          <w:docGrid w:linePitch="360"/>
+        </w:sectPr>
+      </w:pPr>
+    </w:p>
+    <w:p>
+      <w:pPr>
+        <w:spacing w:after="20" w:before="0"/>
+      </w:pPr>
+      <w:r>
+        <w:rPr>
+          <w:rFonts w:ascii="Calibri" w:hAnsi="Calibri"/>
+          <w:b/>
+          <w:i w:val="0"/>
+          <w:color w:val="C25600"/>
+          <w:sz w:val="24"/>
+        </w:rPr>
+        <w:t>Each body's public data interface</w:t>
+      </w:r>
+    </w:p>
+    <w:p>
+      <w:pPr>
+        <w:spacing w:after="60" w:before="0"/>
+      </w:pPr>
+      <w:r>
+        <w:rPr>
+          <w:rFonts w:ascii="Calibri" w:hAnsi="Calibri"/>
+          <w:b w:val="0"/>
+          <w:i w:val="0"/>
+          <w:color w:val="555555"/>
+          <w:sz w:val="18"/>
+        </w:rPr>
+        <w:t>Confirmed from each agency's own pages on 16 October 2026; desk research, not a measured check.</w:t>
+      </w:r>
+    </w:p>
+    <w:tbl>
+      <w:tblPr>
+        <w:tblStyle w:val="TableGrid"/>
+        <w:tblW w:type="auto" w:w="0"/>
+        <w:tblLayout w:type="fixed"/>
+        <w:tblLook w:firstColumn="1" w:firstRow="1" w:lastColumn="0" w:lastRow="0" w:noHBand="0" w:noVBand="1" w:val="04A0"/>
+        <w:tblCellMar>
+          <w:top w:w="0" w:type="dxa"/>
+          <w:bottom w:w="0" w:type="dxa"/>
+          <w:left w:w="45" w:type="dxa"/>
+          <w:right w:w="45" w:type="dxa"/>
+        </w:tblCellMar>
+      </w:tblPr>
+      <w:tblGrid>
+        <w:gridCol w:w="2496"/>
+        <w:gridCol w:w="2496"/>
+        <w:gridCol w:w="2496"/>
+        <w:gridCol w:w="2496"/>
+        <w:gridCol w:w="2496"/>
+        <w:gridCol w:w="2496"/>
+      </w:tblGrid>
+      <w:tr>
+        <w:tc>
+          <w:tcPr>
+            <w:tcW w:type="dxa" w:w="1008"/>
+            <w:shd w:val="clear" w:color="auto" w:fill="EDEDED"/>
+          </w:tcPr>
+          <w:p>
+            <w:r>
+              <w:rPr>
+                <w:rFonts w:ascii="Calibri" w:hAnsi="Calibri"/>
+                <w:b/>
+                <w:i w:val="0"/>
+                <w:color w:val="000000"/>
+                <w:sz w:val="13"/>
+              </w:rPr>
+              <w:t>Body</w:t>
+            </w:r>
+          </w:p>
+        </w:tc>
+        <w:tc>
+          <w:tcPr>
+            <w:tcW w:type="dxa" w:w="2952"/>
+            <w:shd w:val="clear" w:color="auto" w:fill="EDEDED"/>
+          </w:tcPr>
+          <w:p>
+            <w:r>
+              <w:rPr>
+                <w:rFonts w:ascii="Calibri" w:hAnsi="Calibri"/>
+                <w:b/>
+                <w:i w:val="0"/>
+                <w:color w:val="000000"/>
+                <w:sz w:val="13"/>
+              </w:rPr>
+              <w:t>API</w:t>
+            </w:r>
+          </w:p>
+        </w:tc>
+        <w:tc>
+          <w:tcPr>
+            <w:tcW w:type="dxa" w:w="2880"/>
+            <w:shd w:val="clear" w:color="auto" w:fill="EDEDED"/>
+          </w:tcPr>
+          <w:p>
+            <w:r>
+              <w:rPr>
+                <w:rFonts w:ascii="Calibri" w:hAnsi="Calibri"/>
+                <w:b/>
+                <w:i w:val="0"/>
+                <w:color w:val="000000"/>
+                <w:sz w:val="13"/>
+              </w:rPr>
+              <w:t>How a machine calls it</w:t>
+            </w:r>
+          </w:p>
+        </w:tc>
+        <w:tc>
+          <w:tcPr>
+            <w:tcW w:type="dxa" w:w="3168"/>
+            <w:shd w:val="clear" w:color="auto" w:fill="EDEDED"/>
+          </w:tcPr>
+          <w:p>
+            <w:r>
+              <w:rPr>
+                <w:rFonts w:ascii="Calibri" w:hAnsi="Calibri"/>
+                <w:b/>
+                <w:i w:val="0"/>
+                <w:color w:val="000000"/>
+                <w:sz w:val="13"/>
+              </w:rPr>
+              <w:t>How a key is obtained</w:t>
+            </w:r>
+          </w:p>
+        </w:tc>
+        <w:tc>
+          <w:tcPr>
+            <w:tcW w:type="dxa" w:w="2952"/>
+            <w:shd w:val="clear" w:color="auto" w:fill="EDEDED"/>
+          </w:tcPr>
+          <w:p>
+            <w:r>
+              <w:rPr>
+                <w:rFonts w:ascii="Calibri" w:hAnsi="Calibri"/>
+                <w:b/>
+                <w:i w:val="0"/>
+                <w:color w:val="000000"/>
+                <w:sz w:val="13"/>
+              </w:rPr>
+              <w:t>What a key changes</w:t>
+            </w:r>
+          </w:p>
+        </w:tc>
+        <w:tc>
+          <w:tcPr>
+            <w:tcW w:type="dxa" w:w="2016"/>
+            <w:shd w:val="clear" w:color="auto" w:fill="EDEDED"/>
+          </w:tcPr>
+          <w:p>
+            <w:r>
+              <w:rPr>
+                <w:rFonts w:ascii="Calibri" w:hAnsi="Calibri"/>
+                <w:b/>
+                <w:i w:val="0"/>
+                <w:color w:val="000000"/>
+                <w:sz w:val="13"/>
+              </w:rPr>
+              <w:t>Announced to machines: developer page / data.json / api-catalog / data page link</w:t>
+            </w:r>
+          </w:p>
+        </w:tc>
+      </w:tr>
+      <w:tr>
+        <w:tc>
+          <w:tcPr>
+            <w:tcW w:type="dxa" w:w="1008"/>
+          </w:tcPr>
+          <w:p>
+            <w:pPr>
+              <w:spacing w:after="0"/>
+            </w:pPr>
+            <w:r>
+              <w:rPr>
+                <w:rFonts w:ascii="Calibri" w:hAnsi="Calibri"/>
+                <w:b/>
+                <w:i w:val="0"/>
+                <w:color w:val="000000"/>
+                <w:sz w:val="11"/>
+              </w:rPr>
+              <w:t>BEA</w:t>
+            </w:r>
+          </w:p>
+        </w:tc>
+        <w:tc>
+          <w:tcPr>
+            <w:tcW w:type="dxa" w:w="2952"/>
+          </w:tcPr>
+          <w:p>
+            <w:pPr>
+              <w:spacing w:after="0"/>
+            </w:pPr>
+            <w:r>
+              <w:rPr>
+                <w:rFonts w:ascii="Calibri" w:hAnsi="Calibri"/>
+                <w:b w:val="0"/>
+                <w:i w:val="0"/>
+                <w:color w:val="000000"/>
+                <w:sz w:val="11"/>
+              </w:rPr>
+              <w:t>BEA Data Retrieval API, single base https://apps.bea.gov/api/data</w:t>
+            </w:r>
+          </w:p>
+        </w:tc>
+        <w:tc>
+          <w:tcPr>
+            <w:tcW w:type="dxa" w:w="2880"/>
+          </w:tcPr>
+          <w:p>
+            <w:pPr>
+              <w:spacing w:after="0"/>
+            </w:pPr>
+            <w:r>
+              <w:rPr>
+                <w:rFonts w:ascii="Calibri" w:hAnsi="Calibri"/>
+                <w:b w:val="0"/>
+                <w:i w:val="0"/>
+                <w:color w:val="000000"/>
+                <w:sz w:val="11"/>
+              </w:rPr>
+              <w:t>Key (36-character UserID) required in the query string on every request; limits per user of 100 requests, 100 MB and 30 errors per minute, HTTP 429 when exceeded.</w:t>
+            </w:r>
+          </w:p>
+        </w:tc>
+        <w:tc>
+          <w:tcPr>
+            <w:tcW w:type="dxa" w:w="3168"/>
+          </w:tcPr>
+          <w:p>
+            <w:pPr>
+              <w:spacing w:after="0"/>
+            </w:pPr>
+            <w:r>
+              <w:rPr>
+                <w:rFonts w:ascii="Calibri" w:hAnsi="Calibri"/>
+                <w:b w:val="0"/>
+                <w:i w:val="0"/>
+                <w:color w:val="000000"/>
+                <w:sz w:val="11"/>
+              </w:rPr>
+              <w:t>Name or organization name, a valid non-disposable email, and agreeing to terms of service; a person must click the emailed link before the UserID is activated.</w:t>
+            </w:r>
+          </w:p>
+        </w:tc>
+        <w:tc>
+          <w:tcPr>
+            <w:tcW w:type="dxa" w:w="2952"/>
+          </w:tcPr>
+          <w:p>
+            <w:pPr>
+              <w:spacing w:after="0"/>
+            </w:pPr>
+            <w:r>
+              <w:rPr>
+                <w:rFonts w:ascii="Calibri" w:hAnsi="Calibri"/>
+                <w:b w:val="0"/>
+                <w:i w:val="0"/>
+                <w:color w:val="000000"/>
+                <w:sz w:val="11"/>
+              </w:rPr>
+              <w:t>There is no keyless tier; the key is the only way to use the API at all.</w:t>
+            </w:r>
+          </w:p>
+        </w:tc>
+        <w:tc>
+          <w:tcPr>
+            <w:tcW w:type="dxa" w:w="2016"/>
+          </w:tcPr>
+          <w:p>
+            <w:pPr>
+              <w:spacing w:after="0"/>
+            </w:pPr>
+            <w:r>
+              <w:rPr>
+                <w:rFonts w:ascii="Calibri" w:hAnsi="Calibri"/>
+                <w:b w:val="0"/>
+                <w:i w:val="0"/>
+                <w:color w:val="000000"/>
+                <w:sz w:val="11"/>
+              </w:rPr>
+              <w:t>yes / yes / no / yes</w:t>
+            </w:r>
+          </w:p>
+        </w:tc>
+      </w:tr>
+      <w:tr>
+        <w:tc>
+          <w:tcPr>
+            <w:tcW w:type="dxa" w:w="1008"/>
+          </w:tcPr>
+          <w:p>
+            <w:pPr>
+              <w:spacing w:after="0"/>
+            </w:pPr>
+            <w:r>
+              <w:rPr>
+                <w:rFonts w:ascii="Calibri" w:hAnsi="Calibri"/>
+                <w:b/>
+                <w:i w:val="0"/>
+                <w:color w:val="000000"/>
+                <w:sz w:val="11"/>
+              </w:rPr>
+              <w:t>BJS</w:t>
+            </w:r>
+          </w:p>
+        </w:tc>
+        <w:tc>
+          <w:tcPr>
+            <w:tcW w:type="dxa" w:w="2952"/>
+          </w:tcPr>
+          <w:p>
+            <w:pPr>
+              <w:spacing w:after="0"/>
+            </w:pPr>
+            <w:r>
+              <w:rPr>
+                <w:rFonts w:ascii="Calibri" w:hAnsi="Calibri"/>
+                <w:b w:val="0"/>
+                <w:i w:val="0"/>
+                <w:color w:val="000000"/>
+                <w:sz w:val="11"/>
+              </w:rPr>
+              <w:t>NCVS API (also a NIBRS National Estimates API), base https://api.ojp.gov/bjsdataset/v1/; formerly https://data.ojp.usdoj.gov/resource/ on Socrata SODA</w:t>
+            </w:r>
+          </w:p>
+        </w:tc>
+        <w:tc>
+          <w:tcPr>
+            <w:tcW w:type="dxa" w:w="2880"/>
+          </w:tcPr>
+          <w:p>
+            <w:pPr>
+              <w:spacing w:after="0"/>
+            </w:pPr>
+            <w:r>
+              <w:rPr>
+                <w:rFonts w:ascii="Calibri" w:hAnsi="Calibri"/>
+                <w:b w:val="0"/>
+                <w:i w:val="0"/>
+                <w:color w:val="000000"/>
+                <w:sz w:val="11"/>
+              </w:rPr>
+              <w:t>no key stated: a query is endpoint plus format plus parameters; default cap of 1,000 records, raised with a Limit parameter</w:t>
+            </w:r>
+          </w:p>
+        </w:tc>
+        <w:tc>
+          <w:tcPr>
+            <w:tcW w:type="dxa" w:w="3168"/>
+          </w:tcPr>
+          <w:p>
+            <w:pPr>
+              <w:spacing w:after="0"/>
+            </w:pPr>
+            <w:r>
+              <w:rPr>
+                <w:rFonts w:ascii="Calibri" w:hAnsi="Calibri"/>
+                <w:b w:val="0"/>
+                <w:i w:val="0"/>
+                <w:color w:val="000000"/>
+                <w:sz w:val="11"/>
+              </w:rPr>
+              <w:t>not stated</w:t>
+            </w:r>
+          </w:p>
+        </w:tc>
+        <w:tc>
+          <w:tcPr>
+            <w:tcW w:type="dxa" w:w="2952"/>
+          </w:tcPr>
+          <w:p>
+            <w:pPr>
+              <w:spacing w:after="0"/>
+            </w:pPr>
+            <w:r>
+              <w:rPr>
+                <w:rFonts w:ascii="Calibri" w:hAnsi="Calibri"/>
+                <w:b w:val="0"/>
+                <w:i w:val="0"/>
+                <w:color w:val="000000"/>
+                <w:sz w:val="11"/>
+              </w:rPr>
+              <w:t>not stated</w:t>
+            </w:r>
+          </w:p>
+        </w:tc>
+        <w:tc>
+          <w:tcPr>
+            <w:tcW w:type="dxa" w:w="2016"/>
+          </w:tcPr>
+          <w:p>
+            <w:pPr>
+              <w:spacing w:after="0"/>
+            </w:pPr>
+            <w:r>
+              <w:rPr>
+                <w:rFonts w:ascii="Calibri" w:hAnsi="Calibri"/>
+                <w:b w:val="0"/>
+                <w:i w:val="0"/>
+                <w:color w:val="000000"/>
+                <w:sz w:val="11"/>
+              </w:rPr>
+              <w:t>no / not determined / no / no</w:t>
+            </w:r>
+          </w:p>
+        </w:tc>
+      </w:tr>
+      <w:tr>
+        <w:tc>
+          <w:tcPr>
+            <w:tcW w:type="dxa" w:w="1008"/>
+          </w:tcPr>
+          <w:p>
+            <w:pPr>
+              <w:spacing w:after="0"/>
+            </w:pPr>
+            <w:r>
+              <w:rPr>
+                <w:rFonts w:ascii="Calibri" w:hAnsi="Calibri"/>
+                <w:b/>
+                <w:i w:val="0"/>
+                <w:color w:val="000000"/>
+                <w:sz w:val="11"/>
+              </w:rPr>
+              <w:t>BLS</w:t>
+            </w:r>
+          </w:p>
+        </w:tc>
+        <w:tc>
+          <w:tcPr>
+            <w:tcW w:type="dxa" w:w="2952"/>
+          </w:tcPr>
+          <w:p>
+            <w:pPr>
+              <w:spacing w:after="0"/>
+            </w:pPr>
+            <w:r>
+              <w:rPr>
+                <w:rFonts w:ascii="Calibri" w:hAnsi="Calibri"/>
+                <w:b w:val="0"/>
+                <w:i w:val="0"/>
+                <w:color w:val="000000"/>
+                <w:sz w:val="11"/>
+              </w:rPr>
+              <w:t>BLS Public Data API, versions 1.0 and 2.0; v2 base https://api.bls.gov/publicAPI/v2/ (timeseries/data/, timeseries/popular, surveys)</w:t>
+            </w:r>
+          </w:p>
+        </w:tc>
+        <w:tc>
+          <w:tcPr>
+            <w:tcW w:type="dxa" w:w="2880"/>
+          </w:tcPr>
+          <w:p>
+            <w:pPr>
+              <w:spacing w:after="0"/>
+            </w:pPr>
+            <w:r>
+              <w:rPr>
+                <w:rFonts w:ascii="Calibri" w:hAnsi="Calibri"/>
+                <w:b w:val="0"/>
+                <w:i w:val="0"/>
+                <w:color w:val="000000"/>
+                <w:sz w:val="11"/>
+              </w:rPr>
+              <w:t>Version 1.0: no key, 25 queries daily, 25 series and 10 years per query. Version 2.0: registration key required in requests, 500 queries daily, 50 series, 20 years.</w:t>
+            </w:r>
+          </w:p>
+        </w:tc>
+        <w:tc>
+          <w:tcPr>
+            <w:tcW w:type="dxa" w:w="3168"/>
+          </w:tcPr>
+          <w:p>
+            <w:pPr>
+              <w:spacing w:after="0"/>
+            </w:pPr>
+            <w:r>
+              <w:rPr>
+                <w:rFonts w:ascii="Calibri" w:hAnsi="Calibri"/>
+                <w:b w:val="0"/>
+                <w:i w:val="0"/>
+                <w:color w:val="000000"/>
+                <w:sz w:val="11"/>
+              </w:rPr>
+              <w:t>Registration form asks organization name and email, a CAPTCHA, and agreeing to Terms of Service; the key arrives by email, so a person must open that email. No activation link stated.</w:t>
+            </w:r>
+          </w:p>
+        </w:tc>
+        <w:tc>
+          <w:tcPr>
+            <w:tcW w:type="dxa" w:w="2952"/>
+          </w:tcPr>
+          <w:p>
+            <w:pPr>
+              <w:spacing w:after="0"/>
+            </w:pPr>
+            <w:r>
+              <w:rPr>
+                <w:rFonts w:ascii="Calibri" w:hAnsi="Calibri"/>
+                <w:b w:val="0"/>
+                <w:i w:val="0"/>
+                <w:color w:val="000000"/>
+                <w:sz w:val="11"/>
+              </w:rPr>
+              <w:t>Key unlocks Version 2.0: higher query, series and year limits, plus net and percent changes, calculations and annual averages.</w:t>
+            </w:r>
+          </w:p>
+        </w:tc>
+        <w:tc>
+          <w:tcPr>
+            <w:tcW w:type="dxa" w:w="2016"/>
+          </w:tcPr>
+          <w:p>
+            <w:pPr>
+              <w:spacing w:after="0"/>
+            </w:pPr>
+            <w:r>
+              <w:rPr>
+                <w:rFonts w:ascii="Calibri" w:hAnsi="Calibri"/>
+                <w:b w:val="0"/>
+                <w:i w:val="0"/>
+                <w:color w:val="000000"/>
+                <w:sz w:val="11"/>
+              </w:rPr>
+              <w:t>yes / no / no / yes</w:t>
+            </w:r>
+          </w:p>
+        </w:tc>
+      </w:tr>
+      <w:tr>
+        <w:tc>
+          <w:tcPr>
+            <w:tcW w:type="dxa" w:w="1008"/>
+          </w:tcPr>
+          <w:p>
+            <w:pPr>
+              <w:spacing w:after="0"/>
+            </w:pPr>
+            <w:r>
+              <w:rPr>
+                <w:rFonts w:ascii="Calibri" w:hAnsi="Calibri"/>
+                <w:b/>
+                <w:i w:val="0"/>
+                <w:color w:val="000000"/>
+                <w:sz w:val="11"/>
+              </w:rPr>
+              <w:t>BTS</w:t>
+            </w:r>
+          </w:p>
+        </w:tc>
+        <w:tc>
+          <w:tcPr>
+            <w:tcW w:type="dxa" w:w="2952"/>
+          </w:tcPr>
+          <w:p>
+            <w:pPr>
+              <w:spacing w:after="0"/>
+            </w:pPr>
+            <w:r>
+              <w:rPr>
+                <w:rFonts w:ascii="Calibri" w:hAnsi="Calibri"/>
+                <w:b w:val="0"/>
+                <w:i w:val="0"/>
+                <w:color w:val="000000"/>
+                <w:sz w:val="11"/>
+              </w:rPr>
+              <w:t>not determined: www.bts.gov refused every fetch (HTTP 403); its data portal data.bts.gov answered a request without a key, but no BTS page read states API terms</w:t>
+            </w:r>
+          </w:p>
+        </w:tc>
+        <w:tc>
+          <w:tcPr>
+            <w:tcW w:type="dxa" w:w="2880"/>
+          </w:tcPr>
+          <w:p>
+            <w:pPr>
+              <w:spacing w:after="0"/>
+            </w:pPr>
+            <w:r>
+              <w:rPr>
+                <w:rFonts w:ascii="Calibri" w:hAnsi="Calibri"/>
+                <w:b w:val="0"/>
+                <w:i w:val="0"/>
+                <w:color w:val="000000"/>
+                <w:sz w:val="11"/>
+              </w:rPr>
+              <w:t>not stated</w:t>
+            </w:r>
+          </w:p>
+        </w:tc>
+        <w:tc>
+          <w:tcPr>
+            <w:tcW w:type="dxa" w:w="3168"/>
+          </w:tcPr>
+          <w:p>
+            <w:pPr>
+              <w:spacing w:after="0"/>
+            </w:pPr>
+            <w:r>
+              <w:rPr>
+                <w:rFonts w:ascii="Calibri" w:hAnsi="Calibri"/>
+                <w:b w:val="0"/>
+                <w:i w:val="0"/>
+                <w:color w:val="000000"/>
+                <w:sz w:val="11"/>
+              </w:rPr>
+              <w:t>not stated</w:t>
+            </w:r>
+          </w:p>
+        </w:tc>
+        <w:tc>
+          <w:tcPr>
+            <w:tcW w:type="dxa" w:w="2952"/>
+          </w:tcPr>
+          <w:p>
+            <w:pPr>
+              <w:spacing w:after="0"/>
+            </w:pPr>
+            <w:r>
+              <w:rPr>
+                <w:rFonts w:ascii="Calibri" w:hAnsi="Calibri"/>
+                <w:b w:val="0"/>
+                <w:i w:val="0"/>
+                <w:color w:val="000000"/>
+                <w:sz w:val="11"/>
+              </w:rPr>
+              <w:t>not stated</w:t>
+            </w:r>
+          </w:p>
+        </w:tc>
+        <w:tc>
+          <w:tcPr>
+            <w:tcW w:type="dxa" w:w="2016"/>
+          </w:tcPr>
+          <w:p>
+            <w:pPr>
+              <w:spacing w:after="0"/>
+            </w:pPr>
+            <w:r>
+              <w:rPr>
+                <w:rFonts w:ascii="Calibri" w:hAnsi="Calibri"/>
+                <w:b w:val="0"/>
+                <w:i w:val="0"/>
+                <w:color w:val="000000"/>
+                <w:sz w:val="11"/>
+              </w:rPr>
+              <w:t>not determined / not determined / not determined / not determined</w:t>
+            </w:r>
+          </w:p>
+        </w:tc>
+      </w:tr>
+      <w:tr>
+        <w:tc>
+          <w:tcPr>
+            <w:tcW w:type="dxa" w:w="1008"/>
+          </w:tcPr>
+          <w:p>
+            <w:pPr>
+              <w:spacing w:after="0"/>
+            </w:pPr>
+            <w:r>
+              <w:rPr>
+                <w:rFonts w:ascii="Calibri" w:hAnsi="Calibri"/>
+                <w:b/>
+                <w:i w:val="0"/>
+                <w:color w:val="000000"/>
+                <w:sz w:val="11"/>
+              </w:rPr>
+              <w:t>CENSUS</w:t>
+            </w:r>
+          </w:p>
+        </w:tc>
+        <w:tc>
+          <w:tcPr>
+            <w:tcW w:type="dxa" w:w="2952"/>
+          </w:tcPr>
+          <w:p>
+            <w:pPr>
+              <w:spacing w:after="0"/>
+            </w:pPr>
+            <w:r>
+              <w:rPr>
+                <w:rFonts w:ascii="Calibri" w:hAnsi="Calibri"/>
+                <w:b w:val="0"/>
+                <w:i w:val="0"/>
+                <w:color w:val="000000"/>
+                <w:sz w:val="11"/>
+              </w:rPr>
+              <w:t>Census Data API, host api.census.gov/data (dataset paths appended, e.g. api.census.gov/data/2019/pep/charagegroups)</w:t>
+            </w:r>
+          </w:p>
+        </w:tc>
+        <w:tc>
+          <w:tcPr>
+            <w:tcW w:type="dxa" w:w="2880"/>
+          </w:tcPr>
+          <w:p>
+            <w:pPr>
+              <w:spacing w:after="0"/>
+            </w:pPr>
+            <w:r>
+              <w:rPr>
+                <w:rFonts w:ascii="Calibri" w:hAnsi="Calibri"/>
+                <w:b w:val="0"/>
+                <w:i w:val="0"/>
+                <w:color w:val="000000"/>
+                <w:sz w:val="11"/>
+              </w:rPr>
+              <w:t>Key required on all data queries, passed in the URL as &amp;key=; up to 50 variables per query.</w:t>
+            </w:r>
+          </w:p>
+        </w:tc>
+        <w:tc>
+          <w:tcPr>
+            <w:tcW w:type="dxa" w:w="3168"/>
+          </w:tcPr>
+          <w:p>
+            <w:pPr>
+              <w:spacing w:after="0"/>
+            </w:pPr>
+            <w:r>
+              <w:rPr>
+                <w:rFonts w:ascii="Calibri" w:hAnsi="Calibri"/>
+                <w:b w:val="0"/>
+                <w:i w:val="0"/>
+                <w:color w:val="000000"/>
+                <w:sz w:val="11"/>
+              </w:rPr>
+              <w:t>Free pop-up form; email must end .com, .net, .org, .gov or .edu; agree to terms; a person must click the emailed link to register (activate) the key. Other form fields not stated.</w:t>
+            </w:r>
+          </w:p>
+        </w:tc>
+        <w:tc>
+          <w:tcPr>
+            <w:tcW w:type="dxa" w:w="2952"/>
+          </w:tcPr>
+          <w:p>
+            <w:pPr>
+              <w:spacing w:after="0"/>
+            </w:pPr>
+            <w:r>
+              <w:rPr>
+                <w:rFonts w:ascii="Calibri" w:hAnsi="Calibri"/>
+                <w:b w:val="0"/>
+                <w:i w:val="0"/>
+                <w:color w:val="000000"/>
+                <w:sz w:val="11"/>
+              </w:rPr>
+              <w:t>No keyless tier is stated; the key is required for every data query.</w:t>
+            </w:r>
+          </w:p>
+        </w:tc>
+        <w:tc>
+          <w:tcPr>
+            <w:tcW w:type="dxa" w:w="2016"/>
+          </w:tcPr>
+          <w:p>
+            <w:pPr>
+              <w:spacing w:after="0"/>
+            </w:pPr>
+            <w:r>
+              <w:rPr>
+                <w:rFonts w:ascii="Calibri" w:hAnsi="Calibri"/>
+                <w:b w:val="0"/>
+                <w:i w:val="0"/>
+                <w:color w:val="000000"/>
+                <w:sz w:val="11"/>
+              </w:rPr>
+              <w:t>yes / yes / no / yes</w:t>
+            </w:r>
+          </w:p>
+        </w:tc>
+      </w:tr>
+      <w:tr>
+        <w:tc>
+          <w:tcPr>
+            <w:tcW w:type="dxa" w:w="1008"/>
+          </w:tcPr>
+          <w:p>
+            <w:pPr>
+              <w:spacing w:after="0"/>
+            </w:pPr>
+            <w:r>
+              <w:rPr>
+                <w:rFonts w:ascii="Calibri" w:hAnsi="Calibri"/>
+                <w:b/>
+                <w:i w:val="0"/>
+                <w:color w:val="000000"/>
+                <w:sz w:val="11"/>
+              </w:rPr>
+              <w:t>DRSMSU</w:t>
+            </w:r>
+          </w:p>
+        </w:tc>
+        <w:tc>
+          <w:tcPr>
+            <w:tcW w:type="dxa" w:w="2952"/>
+          </w:tcPr>
+          <w:p>
+            <w:pPr>
+              <w:spacing w:after="0"/>
+            </w:pPr>
+            <w:r>
+              <w:rPr>
+                <w:rFonts w:ascii="Calibri" w:hAnsi="Calibri"/>
+                <w:b w:val="0"/>
+                <w:i w:val="0"/>
+                <w:color w:val="000000"/>
+                <w:sz w:val="11"/>
+              </w:rPr>
+              <w:t>no Board API found; for Data Download Program series the Board points to the St. Louis Fed's FRED API (api.stlouisfed.org). SCF is not a DDP release; offered as file downloads</w:t>
+            </w:r>
+          </w:p>
+        </w:tc>
+        <w:tc>
+          <w:tcPr>
+            <w:tcW w:type="dxa" w:w="2880"/>
+          </w:tcPr>
+          <w:p>
+            <w:pPr>
+              <w:spacing w:after="0"/>
+            </w:pPr>
+            <w:r>
+              <w:rPr>
+                <w:rFonts w:ascii="Calibri" w:hAnsi="Calibri"/>
+                <w:b w:val="0"/>
+                <w:i w:val="0"/>
+                <w:color w:val="000000"/>
+                <w:sz w:val="11"/>
+              </w:rPr>
+              <w:t>FRED API: key required, sent in the address (api_key=) or, for Version 2, in an HTTP header</w:t>
+            </w:r>
+          </w:p>
+        </w:tc>
+        <w:tc>
+          <w:tcPr>
+            <w:tcW w:type="dxa" w:w="3168"/>
+          </w:tcPr>
+          <w:p>
+            <w:pPr>
+              <w:spacing w:after="0"/>
+            </w:pPr>
+            <w:r>
+              <w:rPr>
+                <w:rFonts w:ascii="Calibri" w:hAnsi="Calibri"/>
+                <w:b w:val="0"/>
+                <w:i w:val="0"/>
+                <w:color w:val="000000"/>
+                <w:sz w:val="11"/>
+              </w:rPr>
+              <w:t>register a FRED user account with the St. Louis Fed; what registration asks for and any email step are not stated on federalreserve.gov</w:t>
+            </w:r>
+          </w:p>
+        </w:tc>
+        <w:tc>
+          <w:tcPr>
+            <w:tcW w:type="dxa" w:w="2952"/>
+          </w:tcPr>
+          <w:p>
+            <w:pPr>
+              <w:spacing w:after="0"/>
+            </w:pPr>
+            <w:r>
+              <w:rPr>
+                <w:rFonts w:ascii="Calibri" w:hAnsi="Calibri"/>
+                <w:b w:val="0"/>
+                <w:i w:val="0"/>
+                <w:color w:val="000000"/>
+                <w:sz w:val="11"/>
+              </w:rPr>
+              <w:t>not stated</w:t>
+            </w:r>
+          </w:p>
+        </w:tc>
+        <w:tc>
+          <w:tcPr>
+            <w:tcW w:type="dxa" w:w="2016"/>
+          </w:tcPr>
+          <w:p>
+            <w:pPr>
+              <w:spacing w:after="0"/>
+            </w:pPr>
+            <w:r>
+              <w:rPr>
+                <w:rFonts w:ascii="Calibri" w:hAnsi="Calibri"/>
+                <w:b w:val="0"/>
+                <w:i w:val="0"/>
+                <w:color w:val="000000"/>
+                <w:sz w:val="11"/>
+              </w:rPr>
+              <w:t>no / no / no / no</w:t>
+            </w:r>
+          </w:p>
+        </w:tc>
+      </w:tr>
+      <w:tr>
+        <w:tc>
+          <w:tcPr>
+            <w:tcW w:type="dxa" w:w="1008"/>
+          </w:tcPr>
+          <w:p>
+            <w:pPr>
+              <w:spacing w:after="0"/>
+            </w:pPr>
+            <w:r>
+              <w:rPr>
+                <w:rFonts w:ascii="Calibri" w:hAnsi="Calibri"/>
+                <w:b/>
+                <w:i w:val="0"/>
+                <w:color w:val="000000"/>
+                <w:sz w:val="11"/>
+              </w:rPr>
+              <w:t>EIA</w:t>
+            </w:r>
+          </w:p>
+        </w:tc>
+        <w:tc>
+          <w:tcPr>
+            <w:tcW w:type="dxa" w:w="2952"/>
+          </w:tcPr>
+          <w:p>
+            <w:pPr>
+              <w:spacing w:after="0"/>
+            </w:pPr>
+            <w:r>
+              <w:rPr>
+                <w:rFonts w:ascii="Calibri" w:hAnsi="Calibri"/>
+                <w:b w:val="0"/>
+                <w:i w:val="0"/>
+                <w:color w:val="000000"/>
+                <w:sz w:val="11"/>
+              </w:rPr>
+              <w:t>EIA Open Data API (APIv2), base address https://api.eia.gov/v2/</w:t>
+            </w:r>
+          </w:p>
+        </w:tc>
+        <w:tc>
+          <w:tcPr>
+            <w:tcW w:type="dxa" w:w="2880"/>
+          </w:tcPr>
+          <w:p>
+            <w:pPr>
+              <w:spacing w:after="0"/>
+            </w:pPr>
+            <w:r>
+              <w:rPr>
+                <w:rFonts w:ascii="Calibri" w:hAnsi="Calibri"/>
+                <w:b w:val="0"/>
+                <w:i w:val="0"/>
+                <w:color w:val="000000"/>
+                <w:sz w:val="11"/>
+              </w:rPr>
+              <w:t>Key required on every call, passed in the URL as api_key; not read from HTTP headers. Requests must be throttled; per-second and per-hour numbers not stated</w:t>
+            </w:r>
+          </w:p>
+        </w:tc>
+        <w:tc>
+          <w:tcPr>
+            <w:tcW w:type="dxa" w:w="3168"/>
+          </w:tcPr>
+          <w:p>
+            <w:pPr>
+              <w:spacing w:after="0"/>
+            </w:pPr>
+            <w:r>
+              <w:rPr>
+                <w:rFonts w:ascii="Calibri" w:hAnsi="Calibri"/>
+                <w:b w:val="0"/>
+                <w:i w:val="0"/>
+                <w:color w:val="000000"/>
+                <w:sz w:val="11"/>
+              </w:rPr>
+              <w:t>Form asks first name, last name, email, user category, reason for use, and agreement to terms; key is sent by email, so a person must open that email. No activation link stated</w:t>
+            </w:r>
+          </w:p>
+        </w:tc>
+        <w:tc>
+          <w:tcPr>
+            <w:tcW w:type="dxa" w:w="2952"/>
+          </w:tcPr>
+          <w:p>
+            <w:pPr>
+              <w:spacing w:after="0"/>
+            </w:pPr>
+            <w:r>
+              <w:rPr>
+                <w:rFonts w:ascii="Calibri" w:hAnsi="Calibri"/>
+                <w:b w:val="0"/>
+                <w:i w:val="0"/>
+                <w:color w:val="000000"/>
+                <w:sz w:val="11"/>
+              </w:rPr>
+              <w:t>No key, no API access; the key is the unit EIA throttles and can suspend. Bulk download needs no key. No tiered limits stated</w:t>
+            </w:r>
+          </w:p>
+        </w:tc>
+        <w:tc>
+          <w:tcPr>
+            <w:tcW w:type="dxa" w:w="2016"/>
+          </w:tcPr>
+          <w:p>
+            <w:pPr>
+              <w:spacing w:after="0"/>
+            </w:pPr>
+            <w:r>
+              <w:rPr>
+                <w:rFonts w:ascii="Calibri" w:hAnsi="Calibri"/>
+                <w:b w:val="0"/>
+                <w:i w:val="0"/>
+                <w:color w:val="000000"/>
+                <w:sz w:val="11"/>
+              </w:rPr>
+              <w:t>yes / yes / no / yes</w:t>
+            </w:r>
+          </w:p>
+        </w:tc>
+      </w:tr>
+      <w:tr>
+        <w:tc>
+          <w:tcPr>
+            <w:tcW w:type="dxa" w:w="1008"/>
+          </w:tcPr>
+          <w:p>
+            <w:pPr>
+              <w:spacing w:after="0"/>
+            </w:pPr>
+            <w:r>
+              <w:rPr>
+                <w:rFonts w:ascii="Calibri" w:hAnsi="Calibri"/>
+                <w:b/>
+                <w:i w:val="0"/>
+                <w:color w:val="000000"/>
+                <w:sz w:val="11"/>
+              </w:rPr>
+              <w:t>ERS</w:t>
+            </w:r>
+          </w:p>
+        </w:tc>
+        <w:tc>
+          <w:tcPr>
+            <w:tcW w:type="dxa" w:w="2952"/>
+          </w:tcPr>
+          <w:p>
+            <w:pPr>
+              <w:spacing w:after="0"/>
+            </w:pPr>
+            <w:r>
+              <w:rPr>
+                <w:rFonts w:ascii="Calibri" w:hAnsi="Calibri"/>
+                <w:b w:val="0"/>
+                <w:i w:val="0"/>
+                <w:color w:val="000000"/>
+                <w:sz w:val="11"/>
+              </w:rPr>
+              <w:t>ERS Data APIs (ARMS Data API), REST base https://api.ers.usda.gov/data/ with GraphQL at https://api.ers.usda.gov/data/arms/graphql</w:t>
+            </w:r>
+          </w:p>
+        </w:tc>
+        <w:tc>
+          <w:tcPr>
+            <w:tcW w:type="dxa" w:w="2880"/>
+          </w:tcPr>
+          <w:p>
+            <w:pPr>
+              <w:spacing w:after="0"/>
+            </w:pPr>
+            <w:r>
+              <w:rPr>
+                <w:rFonts w:ascii="Calibri" w:hAnsi="Calibri"/>
+                <w:b w:val="0"/>
+                <w:i w:val="0"/>
+                <w:color w:val="000000"/>
+                <w:sz w:val="11"/>
+              </w:rPr>
+              <w:t>Key required, passed in the URL as api_key; no limit stated by ERS</w:t>
+            </w:r>
+          </w:p>
+        </w:tc>
+        <w:tc>
+          <w:tcPr>
+            <w:tcW w:type="dxa" w:w="3168"/>
+          </w:tcPr>
+          <w:p>
+            <w:pPr>
+              <w:spacing w:after="0"/>
+            </w:pPr>
+            <w:r>
+              <w:rPr>
+                <w:rFonts w:ascii="Calibri" w:hAnsi="Calibri"/>
+                <w:b w:val="0"/>
+                <w:i w:val="0"/>
+                <w:color w:val="000000"/>
+                <w:sz w:val="11"/>
+              </w:rPr>
+              <w:t>api.data.gov signup form asks name and a valid email; key is sent automatically to that email, so a person must open it. No activation link stated (key issued through api.data.gov)</w:t>
+            </w:r>
+          </w:p>
+        </w:tc>
+        <w:tc>
+          <w:tcPr>
+            <w:tcW w:type="dxa" w:w="2952"/>
+          </w:tcPr>
+          <w:p>
+            <w:pPr>
+              <w:spacing w:after="0"/>
+            </w:pPr>
+            <w:r>
+              <w:rPr>
+                <w:rFonts w:ascii="Calibri" w:hAnsi="Calibri"/>
+                <w:b w:val="0"/>
+                <w:i w:val="0"/>
+                <w:color w:val="000000"/>
+                <w:sz w:val="11"/>
+              </w:rPr>
+              <w:t>Key is required for access, lets ERS notify users of API changes, and works across Open Government APIs on the shared service. No limits stated</w:t>
+            </w:r>
+          </w:p>
+        </w:tc>
+        <w:tc>
+          <w:tcPr>
+            <w:tcW w:type="dxa" w:w="2016"/>
+          </w:tcPr>
+          <w:p>
+            <w:pPr>
+              <w:spacing w:after="0"/>
+            </w:pPr>
+            <w:r>
+              <w:rPr>
+                <w:rFonts w:ascii="Calibri" w:hAnsi="Calibri"/>
+                <w:b w:val="0"/>
+                <w:i w:val="0"/>
+                <w:color w:val="000000"/>
+                <w:sz w:val="11"/>
+              </w:rPr>
+              <w:t>yes / not determined / no / no</w:t>
+            </w:r>
+          </w:p>
+        </w:tc>
+      </w:tr>
+      <w:tr>
+        <w:tc>
+          <w:tcPr>
+            <w:tcW w:type="dxa" w:w="1008"/>
+          </w:tcPr>
+          <w:p>
+            <w:pPr>
+              <w:spacing w:after="0"/>
+            </w:pPr>
+            <w:r>
+              <w:rPr>
+                <w:rFonts w:ascii="Calibri" w:hAnsi="Calibri"/>
+                <w:b/>
+                <w:i w:val="0"/>
+                <w:color w:val="000000"/>
+                <w:sz w:val="11"/>
+              </w:rPr>
+              <w:t>NAHMSAPHIS</w:t>
+            </w:r>
+          </w:p>
+        </w:tc>
+        <w:tc>
+          <w:tcPr>
+            <w:tcW w:type="dxa" w:w="2952"/>
+          </w:tcPr>
+          <w:p>
+            <w:pPr>
+              <w:spacing w:after="0"/>
+            </w:pPr>
+            <w:r>
+              <w:rPr>
+                <w:rFonts w:ascii="Calibri" w:hAnsi="Calibri"/>
+                <w:b w:val="0"/>
+                <w:i w:val="0"/>
+                <w:color w:val="000000"/>
+                <w:sz w:val="11"/>
+              </w:rPr>
+              <w:t>no public API found</w:t>
+            </w:r>
+          </w:p>
+        </w:tc>
+        <w:tc>
+          <w:tcPr>
+            <w:tcW w:type="dxa" w:w="2880"/>
+          </w:tcPr>
+          <w:p>
+            <w:pPr>
+              <w:spacing w:after="0"/>
+            </w:pPr>
+            <w:r>
+              <w:rPr>
+                <w:rFonts w:ascii="Calibri" w:hAnsi="Calibri"/>
+                <w:b w:val="0"/>
+                <w:i w:val="0"/>
+                <w:color w:val="000000"/>
+                <w:sz w:val="11"/>
+              </w:rPr>
+              <w:t>not stated</w:t>
+            </w:r>
+          </w:p>
+        </w:tc>
+        <w:tc>
+          <w:tcPr>
+            <w:tcW w:type="dxa" w:w="3168"/>
+          </w:tcPr>
+          <w:p>
+            <w:pPr>
+              <w:spacing w:after="0"/>
+            </w:pPr>
+            <w:r>
+              <w:rPr>
+                <w:rFonts w:ascii="Calibri" w:hAnsi="Calibri"/>
+                <w:b w:val="0"/>
+                <w:i w:val="0"/>
+                <w:color w:val="000000"/>
+                <w:sz w:val="11"/>
+              </w:rPr>
+              <w:t>not stated</w:t>
+            </w:r>
+          </w:p>
+        </w:tc>
+        <w:tc>
+          <w:tcPr>
+            <w:tcW w:type="dxa" w:w="2952"/>
+          </w:tcPr>
+          <w:p>
+            <w:pPr>
+              <w:spacing w:after="0"/>
+            </w:pPr>
+            <w:r>
+              <w:rPr>
+                <w:rFonts w:ascii="Calibri" w:hAnsi="Calibri"/>
+                <w:b w:val="0"/>
+                <w:i w:val="0"/>
+                <w:color w:val="000000"/>
+                <w:sz w:val="11"/>
+              </w:rPr>
+              <w:t>not stated</w:t>
+            </w:r>
+          </w:p>
+        </w:tc>
+        <w:tc>
+          <w:tcPr>
+            <w:tcW w:type="dxa" w:w="2016"/>
+          </w:tcPr>
+          <w:p>
+            <w:pPr>
+              <w:spacing w:after="0"/>
+            </w:pPr>
+            <w:r>
+              <w:rPr>
+                <w:rFonts w:ascii="Calibri" w:hAnsi="Calibri"/>
+                <w:b w:val="0"/>
+                <w:i w:val="0"/>
+                <w:color w:val="000000"/>
+                <w:sz w:val="11"/>
+              </w:rPr>
+              <w:t>no / not determined / no / no</w:t>
+            </w:r>
+          </w:p>
+        </w:tc>
+      </w:tr>
+      <w:tr>
+        <w:tc>
+          <w:tcPr>
+            <w:tcW w:type="dxa" w:w="1008"/>
+          </w:tcPr>
+          <w:p>
+            <w:pPr>
+              <w:spacing w:after="0"/>
+            </w:pPr>
+            <w:r>
+              <w:rPr>
+                <w:rFonts w:ascii="Calibri" w:hAnsi="Calibri"/>
+                <w:b/>
+                <w:i w:val="0"/>
+                <w:color w:val="000000"/>
+                <w:sz w:val="11"/>
+              </w:rPr>
+              <w:t>NASS</w:t>
+            </w:r>
+          </w:p>
+        </w:tc>
+        <w:tc>
+          <w:tcPr>
+            <w:tcW w:type="dxa" w:w="2952"/>
+          </w:tcPr>
+          <w:p>
+            <w:pPr>
+              <w:spacing w:after="0"/>
+            </w:pPr>
+            <w:r>
+              <w:rPr>
+                <w:rFonts w:ascii="Calibri" w:hAnsi="Calibri"/>
+                <w:b w:val="0"/>
+                <w:i w:val="0"/>
+                <w:color w:val="000000"/>
+                <w:sz w:val="11"/>
+              </w:rPr>
+              <w:t>Quick Stats API, base address https://quickstats.nass.usda.gov/api/ (resources api_GET, get_param_values, get_counts)</w:t>
+            </w:r>
+          </w:p>
+        </w:tc>
+        <w:tc>
+          <w:tcPr>
+            <w:tcW w:type="dxa" w:w="2880"/>
+          </w:tcPr>
+          <w:p>
+            <w:pPr>
+              <w:spacing w:after="0"/>
+            </w:pPr>
+            <w:r>
+              <w:rPr>
+                <w:rFonts w:ascii="Calibri" w:hAnsi="Calibri"/>
+                <w:b w:val="0"/>
+                <w:i w:val="0"/>
+                <w:color w:val="000000"/>
+                <w:sz w:val="11"/>
+              </w:rPr>
+              <w:t>Key required, passed in the URL as key=. Each request returns at most 50,000 records; no rate limit stated</w:t>
+            </w:r>
+          </w:p>
+        </w:tc>
+        <w:tc>
+          <w:tcPr>
+            <w:tcW w:type="dxa" w:w="3168"/>
+          </w:tcPr>
+          <w:p>
+            <w:pPr>
+              <w:spacing w:after="0"/>
+            </w:pPr>
+            <w:r>
+              <w:rPr>
+                <w:rFonts w:ascii="Calibri" w:hAnsi="Calibri"/>
+                <w:b w:val="0"/>
+                <w:i w:val="0"/>
+                <w:color w:val="000000"/>
+                <w:sz w:val="11"/>
+              </w:rPr>
+              <w:t>Form asks email (required) and name/organization (optional), plus agreeing to the Terms of Service; key arrives by email, no activation link stated</w:t>
+            </w:r>
+          </w:p>
+        </w:tc>
+        <w:tc>
+          <w:tcPr>
+            <w:tcW w:type="dxa" w:w="2952"/>
+          </w:tcPr>
+          <w:p>
+            <w:pPr>
+              <w:spacing w:after="0"/>
+            </w:pPr>
+            <w:r>
+              <w:rPr>
+                <w:rFonts w:ascii="Calibri" w:hAnsi="Calibri"/>
+                <w:b w:val="0"/>
+                <w:i w:val="0"/>
+                <w:color w:val="000000"/>
+                <w:sz w:val="11"/>
+              </w:rPr>
+              <w:t>not stated</w:t>
+            </w:r>
+          </w:p>
+        </w:tc>
+        <w:tc>
+          <w:tcPr>
+            <w:tcW w:type="dxa" w:w="2016"/>
+          </w:tcPr>
+          <w:p>
+            <w:pPr>
+              <w:spacing w:after="0"/>
+            </w:pPr>
+            <w:r>
+              <w:rPr>
+                <w:rFonts w:ascii="Calibri" w:hAnsi="Calibri"/>
+                <w:b w:val="0"/>
+                <w:i w:val="0"/>
+                <w:color w:val="000000"/>
+                <w:sz w:val="11"/>
+              </w:rPr>
+              <w:t>yes / not determined / no / yes</w:t>
+            </w:r>
+          </w:p>
+        </w:tc>
+      </w:tr>
+      <w:tr>
+        <w:tc>
+          <w:tcPr>
+            <w:tcW w:type="dxa" w:w="1008"/>
+          </w:tcPr>
+          <w:p>
+            <w:pPr>
+              <w:spacing w:after="0"/>
+            </w:pPr>
+            <w:r>
+              <w:rPr>
+                <w:rFonts w:ascii="Calibri" w:hAnsi="Calibri"/>
+                <w:b/>
+                <w:i w:val="0"/>
+                <w:color w:val="000000"/>
+                <w:sz w:val="11"/>
+              </w:rPr>
+              <w:t>NCES</w:t>
+            </w:r>
+          </w:p>
+        </w:tc>
+        <w:tc>
+          <w:tcPr>
+            <w:tcW w:type="dxa" w:w="2952"/>
+          </w:tcPr>
+          <w:p>
+            <w:pPr>
+              <w:spacing w:after="0"/>
+            </w:pPr>
+            <w:r>
+              <w:rPr>
+                <w:rFonts w:ascii="Calibri" w:hAnsi="Calibri"/>
+                <w:b w:val="0"/>
+                <w:i w:val="0"/>
+                <w:color w:val="000000"/>
+                <w:sz w:val="11"/>
+              </w:rPr>
+              <w:t>No NCES data API documented on NCES pages; EDGE geodata are offered as GIS web services via an off-site ArcGIS Open Data site. ED's College Scorecard API (https://api.data.gov/ed/collegescorecard/v1/schools) is departmental, not NCES</w:t>
+            </w:r>
+          </w:p>
+        </w:tc>
+        <w:tc>
+          <w:tcPr>
+            <w:tcW w:type="dxa" w:w="2880"/>
+          </w:tcPr>
+          <w:p>
+            <w:pPr>
+              <w:spacing w:after="0"/>
+            </w:pPr>
+            <w:r>
+              <w:rPr>
+                <w:rFonts w:ascii="Calibri" w:hAnsi="Calibri"/>
+                <w:b w:val="0"/>
+                <w:i w:val="0"/>
+                <w:color w:val="000000"/>
+                <w:sz w:val="11"/>
+              </w:rPr>
+              <w:t>NCES EDGE services: not stated. College Scorecard (ED, not NCES): key required on every request, passed in the address as api_key; default 1,000 requests per IP address per hour</w:t>
+            </w:r>
+          </w:p>
+        </w:tc>
+        <w:tc>
+          <w:tcPr>
+            <w:tcW w:type="dxa" w:w="3168"/>
+          </w:tcPr>
+          <w:p>
+            <w:pPr>
+              <w:spacing w:after="0"/>
+            </w:pPr>
+            <w:r>
+              <w:rPr>
+                <w:rFonts w:ascii="Calibri" w:hAnsi="Calibri"/>
+                <w:b w:val="0"/>
+                <w:i w:val="0"/>
+                <w:color w:val="000000"/>
+                <w:sz w:val="11"/>
+              </w:rPr>
+              <w:t>College Scorecard: security challenge, then a registration form (fields not stated); the key is emailed, so a person must open an email to receive it. NCES: not stated</w:t>
+            </w:r>
+          </w:p>
+        </w:tc>
+        <w:tc>
+          <w:tcPr>
+            <w:tcW w:type="dxa" w:w="2952"/>
+          </w:tcPr>
+          <w:p>
+            <w:pPr>
+              <w:spacing w:after="0"/>
+            </w:pPr>
+            <w:r>
+              <w:rPr>
+                <w:rFonts w:ascii="Calibri" w:hAnsi="Calibri"/>
+                <w:b w:val="0"/>
+                <w:i w:val="0"/>
+                <w:color w:val="000000"/>
+                <w:sz w:val="11"/>
+              </w:rPr>
+              <w:t>not stated; College Scorecard has no keyless tier, the key is required for all requests</w:t>
+            </w:r>
+          </w:p>
+        </w:tc>
+        <w:tc>
+          <w:tcPr>
+            <w:tcW w:type="dxa" w:w="2016"/>
+          </w:tcPr>
+          <w:p>
+            <w:pPr>
+              <w:spacing w:after="0"/>
+            </w:pPr>
+            <w:r>
+              <w:rPr>
+                <w:rFonts w:ascii="Calibri" w:hAnsi="Calibri"/>
+                <w:b w:val="0"/>
+                <w:i w:val="0"/>
+                <w:color w:val="000000"/>
+                <w:sz w:val="11"/>
+              </w:rPr>
+              <w:t>no / not determined / no / no</w:t>
+            </w:r>
+          </w:p>
+        </w:tc>
+      </w:tr>
+      <w:tr>
+        <w:tc>
+          <w:tcPr>
+            <w:tcW w:type="dxa" w:w="1008"/>
+          </w:tcPr>
+          <w:p>
+            <w:pPr>
+              <w:spacing w:after="0"/>
+            </w:pPr>
+            <w:r>
+              <w:rPr>
+                <w:rFonts w:ascii="Calibri" w:hAnsi="Calibri"/>
+                <w:b/>
+                <w:i w:val="0"/>
+                <w:color w:val="000000"/>
+                <w:sz w:val="11"/>
+              </w:rPr>
+              <w:t>NCHS</w:t>
+            </w:r>
+          </w:p>
+        </w:tc>
+        <w:tc>
+          <w:tcPr>
+            <w:tcW w:type="dxa" w:w="2952"/>
+          </w:tcPr>
+          <w:p>
+            <w:pPr>
+              <w:spacing w:after="0"/>
+            </w:pPr>
+            <w:r>
+              <w:rPr>
+                <w:rFonts w:ascii="Calibri" w:hAnsi="Calibri"/>
+                <w:b w:val="0"/>
+                <w:i w:val="0"/>
+                <w:color w:val="000000"/>
+                <w:sz w:val="11"/>
+              </w:rPr>
+              <w:t>CDC WONDER API, POST to https://wonder.cdc.gov/controller/datarequest/[database ID]; national NVSS data only. data.cdc.gov (Socrata) is also used, but its API terms are only on non-.gov dev.socrata.com</w:t>
+            </w:r>
+          </w:p>
+        </w:tc>
+        <w:tc>
+          <w:tcPr>
+            <w:tcW w:type="dxa" w:w="2880"/>
+          </w:tcPr>
+          <w:p>
+            <w:pPr>
+              <w:spacing w:after="0"/>
+            </w:pPr>
+            <w:r>
+              <w:rPr>
+                <w:rFonts w:ascii="Calibri" w:hAnsi="Calibri"/>
+                <w:b w:val="0"/>
+                <w:i w:val="0"/>
+                <w:color w:val="000000"/>
+                <w:sz w:val="11"/>
+              </w:rPr>
+              <w:t>WONDER: no key described; POST request with XML, and consent to data use restrictions required in each request. data.cdc.gov app token terms: not stated on .gov pages</w:t>
+            </w:r>
+          </w:p>
+        </w:tc>
+        <w:tc>
+          <w:tcPr>
+            <w:tcW w:type="dxa" w:w="3168"/>
+          </w:tcPr>
+          <w:p>
+            <w:pPr>
+              <w:spacing w:after="0"/>
+            </w:pPr>
+            <w:r>
+              <w:rPr>
+                <w:rFonts w:ascii="Calibri" w:hAnsi="Calibri"/>
+                <w:b w:val="0"/>
+                <w:i w:val="0"/>
+                <w:color w:val="000000"/>
+                <w:sz w:val="11"/>
+              </w:rPr>
+              <w:t>not stated</w:t>
+            </w:r>
+          </w:p>
+        </w:tc>
+        <w:tc>
+          <w:tcPr>
+            <w:tcW w:type="dxa" w:w="2952"/>
+          </w:tcPr>
+          <w:p>
+            <w:pPr>
+              <w:spacing w:after="0"/>
+            </w:pPr>
+            <w:r>
+              <w:rPr>
+                <w:rFonts w:ascii="Calibri" w:hAnsi="Calibri"/>
+                <w:b w:val="0"/>
+                <w:i w:val="0"/>
+                <w:color w:val="000000"/>
+                <w:sz w:val="11"/>
+              </w:rPr>
+              <w:t>not stated</w:t>
+            </w:r>
+          </w:p>
+        </w:tc>
+        <w:tc>
+          <w:tcPr>
+            <w:tcW w:type="dxa" w:w="2016"/>
+          </w:tcPr>
+          <w:p>
+            <w:pPr>
+              <w:spacing w:after="0"/>
+            </w:pPr>
+            <w:r>
+              <w:rPr>
+                <w:rFonts w:ascii="Calibri" w:hAnsi="Calibri"/>
+                <w:b w:val="0"/>
+                <w:i w:val="0"/>
+                <w:color w:val="000000"/>
+                <w:sz w:val="11"/>
+              </w:rPr>
+              <w:t>no / not determined / no / no</w:t>
+            </w:r>
+          </w:p>
+        </w:tc>
+      </w:tr>
+      <w:tr>
+        <w:tc>
+          <w:tcPr>
+            <w:tcW w:type="dxa" w:w="1008"/>
+          </w:tcPr>
+          <w:p>
+            <w:pPr>
+              <w:spacing w:after="0"/>
+            </w:pPr>
+            <w:r>
+              <w:rPr>
+                <w:rFonts w:ascii="Calibri" w:hAnsi="Calibri"/>
+                <w:b/>
+                <w:i w:val="0"/>
+                <w:color w:val="000000"/>
+                <w:sz w:val="11"/>
+              </w:rPr>
+              <w:t>NCSES</w:t>
+            </w:r>
+          </w:p>
+        </w:tc>
+        <w:tc>
+          <w:tcPr>
+            <w:tcW w:type="dxa" w:w="2952"/>
+          </w:tcPr>
+          <w:p>
+            <w:pPr>
+              <w:spacing w:after="0"/>
+            </w:pPr>
+            <w:r>
+              <w:rPr>
+                <w:rFonts w:ascii="Calibri" w:hAnsi="Calibri"/>
+                <w:b w:val="0"/>
+                <w:i w:val="0"/>
+                <w:color w:val="000000"/>
+                <w:sz w:val="11"/>
+              </w:rPr>
+              <w:t>no public API found; NCSES offers interactive web tools (Data Explorer, Chart Builder, Table Builder on ncsesdata.nsf.gov) and file downloads, none documented as an API</w:t>
+            </w:r>
+          </w:p>
+        </w:tc>
+        <w:tc>
+          <w:tcPr>
+            <w:tcW w:type="dxa" w:w="2880"/>
+          </w:tcPr>
+          <w:p>
+            <w:pPr>
+              <w:spacing w:after="0"/>
+            </w:pPr>
+            <w:r>
+              <w:rPr>
+                <w:rFonts w:ascii="Calibri" w:hAnsi="Calibri"/>
+                <w:b w:val="0"/>
+                <w:i w:val="0"/>
+                <w:color w:val="000000"/>
+                <w:sz w:val="11"/>
+              </w:rPr>
+              <w:t>not stated</w:t>
+            </w:r>
+          </w:p>
+        </w:tc>
+        <w:tc>
+          <w:tcPr>
+            <w:tcW w:type="dxa" w:w="3168"/>
+          </w:tcPr>
+          <w:p>
+            <w:pPr>
+              <w:spacing w:after="0"/>
+            </w:pPr>
+            <w:r>
+              <w:rPr>
+                <w:rFonts w:ascii="Calibri" w:hAnsi="Calibri"/>
+                <w:b w:val="0"/>
+                <w:i w:val="0"/>
+                <w:color w:val="000000"/>
+                <w:sz w:val="11"/>
+              </w:rPr>
+              <w:t>not stated</w:t>
+            </w:r>
+          </w:p>
+        </w:tc>
+        <w:tc>
+          <w:tcPr>
+            <w:tcW w:type="dxa" w:w="2952"/>
+          </w:tcPr>
+          <w:p>
+            <w:pPr>
+              <w:spacing w:after="0"/>
+            </w:pPr>
+            <w:r>
+              <w:rPr>
+                <w:rFonts w:ascii="Calibri" w:hAnsi="Calibri"/>
+                <w:b w:val="0"/>
+                <w:i w:val="0"/>
+                <w:color w:val="000000"/>
+                <w:sz w:val="11"/>
+              </w:rPr>
+              <w:t>not stated</w:t>
+            </w:r>
+          </w:p>
+        </w:tc>
+        <w:tc>
+          <w:tcPr>
+            <w:tcW w:type="dxa" w:w="2016"/>
+          </w:tcPr>
+          <w:p>
+            <w:pPr>
+              <w:spacing w:after="0"/>
+            </w:pPr>
+            <w:r>
+              <w:rPr>
+                <w:rFonts w:ascii="Calibri" w:hAnsi="Calibri"/>
+                <w:b w:val="0"/>
+                <w:i w:val="0"/>
+                <w:color w:val="000000"/>
+                <w:sz w:val="11"/>
+              </w:rPr>
+              <w:t>no / no / no / no</w:t>
+            </w:r>
+          </w:p>
+        </w:tc>
+      </w:tr>
+      <w:tr>
+        <w:tc>
+          <w:tcPr>
+            <w:tcW w:type="dxa" w:w="1008"/>
+          </w:tcPr>
+          <w:p>
+            <w:pPr>
+              <w:spacing w:after="0"/>
+            </w:pPr>
+            <w:r>
+              <w:rPr>
+                <w:rFonts w:ascii="Calibri" w:hAnsi="Calibri"/>
+                <w:b/>
+                <w:i w:val="0"/>
+                <w:color w:val="000000"/>
+                <w:sz w:val="11"/>
+              </w:rPr>
+              <w:t>ORES</w:t>
+            </w:r>
+          </w:p>
+        </w:tc>
+        <w:tc>
+          <w:tcPr>
+            <w:tcW w:type="dxa" w:w="2952"/>
+          </w:tcPr>
+          <w:p>
+            <w:pPr>
+              <w:spacing w:after="0"/>
+            </w:pPr>
+            <w:r>
+              <w:rPr>
+                <w:rFonts w:ascii="Calibri" w:hAnsi="Calibri"/>
+                <w:b w:val="0"/>
+                <w:i w:val="0"/>
+                <w:color w:val="000000"/>
+                <w:sz w:val="11"/>
+              </w:rPr>
+              <w:t>not determined: www.ssa.gov returned HTTP 403 Forbidden to every WebFetch request, so no SSA page could be read</w:t>
+            </w:r>
+          </w:p>
+        </w:tc>
+        <w:tc>
+          <w:tcPr>
+            <w:tcW w:type="dxa" w:w="2880"/>
+          </w:tcPr>
+          <w:p>
+            <w:pPr>
+              <w:spacing w:after="0"/>
+            </w:pPr>
+            <w:r>
+              <w:rPr>
+                <w:rFonts w:ascii="Calibri" w:hAnsi="Calibri"/>
+                <w:b w:val="0"/>
+                <w:i w:val="0"/>
+                <w:color w:val="000000"/>
+                <w:sz w:val="11"/>
+              </w:rPr>
+              <w:t>not determined: no SSA page could be fetched (HTTP 403)</w:t>
+            </w:r>
+          </w:p>
+        </w:tc>
+        <w:tc>
+          <w:tcPr>
+            <w:tcW w:type="dxa" w:w="3168"/>
+          </w:tcPr>
+          <w:p>
+            <w:pPr>
+              <w:spacing w:after="0"/>
+            </w:pPr>
+            <w:r>
+              <w:rPr>
+                <w:rFonts w:ascii="Calibri" w:hAnsi="Calibri"/>
+                <w:b w:val="0"/>
+                <w:i w:val="0"/>
+                <w:color w:val="000000"/>
+                <w:sz w:val="11"/>
+              </w:rPr>
+              <w:t>not determined: no SSA page could be fetched (HTTP 403)</w:t>
+            </w:r>
+          </w:p>
+        </w:tc>
+        <w:tc>
+          <w:tcPr>
+            <w:tcW w:type="dxa" w:w="2952"/>
+          </w:tcPr>
+          <w:p>
+            <w:pPr>
+              <w:spacing w:after="0"/>
+            </w:pPr>
+            <w:r>
+              <w:rPr>
+                <w:rFonts w:ascii="Calibri" w:hAnsi="Calibri"/>
+                <w:b w:val="0"/>
+                <w:i w:val="0"/>
+                <w:color w:val="000000"/>
+                <w:sz w:val="11"/>
+              </w:rPr>
+              <w:t>not determined: no SSA page could be fetched (HTTP 403)</w:t>
+            </w:r>
+          </w:p>
+        </w:tc>
+        <w:tc>
+          <w:tcPr>
+            <w:tcW w:type="dxa" w:w="2016"/>
+          </w:tcPr>
+          <w:p>
+            <w:pPr>
+              <w:spacing w:after="0"/>
+            </w:pPr>
+            <w:r>
+              <w:rPr>
+                <w:rFonts w:ascii="Calibri" w:hAnsi="Calibri"/>
+                <w:b w:val="0"/>
+                <w:i w:val="0"/>
+                <w:color w:val="000000"/>
+                <w:sz w:val="11"/>
+              </w:rPr>
+              <w:t>not determined / not determined / not determined / not determined</w:t>
+            </w:r>
+          </w:p>
+        </w:tc>
+      </w:tr>
+      <w:tr>
+        <w:tc>
+          <w:tcPr>
+            <w:tcW w:type="dxa" w:w="1008"/>
+          </w:tcPr>
+          <w:p>
+            <w:pPr>
+              <w:spacing w:after="0"/>
+            </w:pPr>
+            <w:r>
+              <w:rPr>
+                <w:rFonts w:ascii="Calibri" w:hAnsi="Calibri"/>
+                <w:b/>
+                <w:i w:val="0"/>
+                <w:color w:val="000000"/>
+                <w:sz w:val="11"/>
+              </w:rPr>
+              <w:t>SAMHSACBHS</w:t>
+            </w:r>
+          </w:p>
+        </w:tc>
+        <w:tc>
+          <w:tcPr>
+            <w:tcW w:type="dxa" w:w="2952"/>
+          </w:tcPr>
+          <w:p>
+            <w:pPr>
+              <w:spacing w:after="0"/>
+            </w:pPr>
+            <w:r>
+              <w:rPr>
+                <w:rFonts w:ascii="Calibri" w:hAnsi="Calibri"/>
+                <w:b w:val="0"/>
+                <w:i w:val="0"/>
+                <w:color w:val="000000"/>
+                <w:sz w:val="11"/>
+              </w:rPr>
+              <w:t>FindTreatment.gov API (SAMHSA CBHSQ, BHSIS), JSON GET at https://{host}/locator/exportsAsJson/v2, e.g. https://findtreatment.gov/locator/exportsAsJson/; documented only in a PDF developer guide v1.12 (August 17, 2026). No NSDUH data API found</w:t>
+            </w:r>
+          </w:p>
+        </w:tc>
+        <w:tc>
+          <w:tcPr>
+            <w:tcW w:type="dxa" w:w="2880"/>
+          </w:tcPr>
+          <w:p>
+            <w:pPr>
+              <w:spacing w:after="0"/>
+            </w:pPr>
+            <w:r>
+              <w:rPr>
+                <w:rFonts w:ascii="Calibri" w:hAnsi="Calibri"/>
+                <w:b w:val="0"/>
+                <w:i w:val="0"/>
+                <w:color w:val="000000"/>
+                <w:sz w:val="11"/>
+              </w:rPr>
+              <w:t>No key or token appears in the guide or its sample URLs; plain query string parameters; page size capped at 2000. The guide addresses an 'approved user' but describes no approval step</w:t>
+            </w:r>
+          </w:p>
+        </w:tc>
+        <w:tc>
+          <w:tcPr>
+            <w:tcW w:type="dxa" w:w="3168"/>
+          </w:tcPr>
+          <w:p>
+            <w:pPr>
+              <w:spacing w:after="0"/>
+            </w:pPr>
+            <w:r>
+              <w:rPr>
+                <w:rFonts w:ascii="Calibri" w:hAnsi="Calibri"/>
+                <w:b w:val="0"/>
+                <w:i w:val="0"/>
+                <w:color w:val="000000"/>
+                <w:sz w:val="11"/>
+              </w:rPr>
+              <w:t>not stated</w:t>
+            </w:r>
+          </w:p>
+        </w:tc>
+        <w:tc>
+          <w:tcPr>
+            <w:tcW w:type="dxa" w:w="2952"/>
+          </w:tcPr>
+          <w:p>
+            <w:pPr>
+              <w:spacing w:after="0"/>
+            </w:pPr>
+            <w:r>
+              <w:rPr>
+                <w:rFonts w:ascii="Calibri" w:hAnsi="Calibri"/>
+                <w:b w:val="0"/>
+                <w:i w:val="0"/>
+                <w:color w:val="000000"/>
+                <w:sz w:val="11"/>
+              </w:rPr>
+              <w:t>not stated</w:t>
+            </w:r>
+          </w:p>
+        </w:tc>
+        <w:tc>
+          <w:tcPr>
+            <w:tcW w:type="dxa" w:w="2016"/>
+          </w:tcPr>
+          <w:p>
+            <w:pPr>
+              <w:spacing w:after="0"/>
+            </w:pPr>
+            <w:r>
+              <w:rPr>
+                <w:rFonts w:ascii="Calibri" w:hAnsi="Calibri"/>
+                <w:b w:val="0"/>
+                <w:i w:val="0"/>
+                <w:color w:val="000000"/>
+                <w:sz w:val="11"/>
+              </w:rPr>
+              <w:t>no / not determined / no / no</w:t>
+            </w:r>
+          </w:p>
+        </w:tc>
+      </w:tr>
+      <w:tr>
+        <w:tc>
+          <w:tcPr>
+            <w:tcW w:type="dxa" w:w="1008"/>
+          </w:tcPr>
+          <w:p>
+            <w:pPr>
+              <w:spacing w:after="0"/>
+            </w:pPr>
+            <w:r>
+              <w:rPr>
+                <w:rFonts w:ascii="Calibri" w:hAnsi="Calibri"/>
+                <w:b/>
+                <w:i w:val="0"/>
+                <w:color w:val="000000"/>
+                <w:sz w:val="11"/>
+              </w:rPr>
+              <w:t>SOI</w:t>
+            </w:r>
+          </w:p>
+        </w:tc>
+        <w:tc>
+          <w:tcPr>
+            <w:tcW w:type="dxa" w:w="2952"/>
+          </w:tcPr>
+          <w:p>
+            <w:pPr>
+              <w:spacing w:after="0"/>
+            </w:pPr>
+            <w:r>
+              <w:rPr>
+                <w:rFonts w:ascii="Calibri" w:hAnsi="Calibri"/>
+                <w:b w:val="0"/>
+                <w:i w:val="0"/>
+                <w:color w:val="000000"/>
+                <w:sz w:val="11"/>
+              </w:rPr>
+              <w:t>no public API found; SOI states its data are available in electronic format and printed publications, and some files are for sale</w:t>
+            </w:r>
+          </w:p>
+        </w:tc>
+        <w:tc>
+          <w:tcPr>
+            <w:tcW w:type="dxa" w:w="2880"/>
+          </w:tcPr>
+          <w:p>
+            <w:pPr>
+              <w:spacing w:after="0"/>
+            </w:pPr>
+            <w:r>
+              <w:rPr>
+                <w:rFonts w:ascii="Calibri" w:hAnsi="Calibri"/>
+                <w:b w:val="0"/>
+                <w:i w:val="0"/>
+                <w:color w:val="000000"/>
+                <w:sz w:val="11"/>
+              </w:rPr>
+              <w:t>not stated</w:t>
+            </w:r>
+          </w:p>
+        </w:tc>
+        <w:tc>
+          <w:tcPr>
+            <w:tcW w:type="dxa" w:w="3168"/>
+          </w:tcPr>
+          <w:p>
+            <w:pPr>
+              <w:spacing w:after="0"/>
+            </w:pPr>
+            <w:r>
+              <w:rPr>
+                <w:rFonts w:ascii="Calibri" w:hAnsi="Calibri"/>
+                <w:b w:val="0"/>
+                <w:i w:val="0"/>
+                <w:color w:val="000000"/>
+                <w:sz w:val="11"/>
+              </w:rPr>
+              <w:t>not stated</w:t>
+            </w:r>
+          </w:p>
+        </w:tc>
+        <w:tc>
+          <w:tcPr>
+            <w:tcW w:type="dxa" w:w="2952"/>
+          </w:tcPr>
+          <w:p>
+            <w:pPr>
+              <w:spacing w:after="0"/>
+            </w:pPr>
+            <w:r>
+              <w:rPr>
+                <w:rFonts w:ascii="Calibri" w:hAnsi="Calibri"/>
+                <w:b w:val="0"/>
+                <w:i w:val="0"/>
+                <w:color w:val="000000"/>
+                <w:sz w:val="11"/>
+              </w:rPr>
+              <w:t>not stated</w:t>
+            </w:r>
+          </w:p>
+        </w:tc>
+        <w:tc>
+          <w:tcPr>
+            <w:tcW w:type="dxa" w:w="2016"/>
+          </w:tcPr>
+          <w:p>
+            <w:pPr>
+              <w:spacing w:after="0"/>
+            </w:pPr>
+            <w:r>
+              <w:rPr>
+                <w:rFonts w:ascii="Calibri" w:hAnsi="Calibri"/>
+                <w:b w:val="0"/>
+                <w:i w:val="0"/>
+                <w:color w:val="000000"/>
+                <w:sz w:val="11"/>
+              </w:rPr>
+              <w:t>no / not determined / no / no</w:t>
+            </w:r>
+          </w:p>
+        </w:tc>
+      </w:tr>
+      <w:tr>
+        <w:tc>
+          <w:tcPr>
+            <w:tcW w:type="dxa" w:w="1008"/>
+          </w:tcPr>
+          <w:p>
+            <w:pPr>
+              <w:spacing w:after="0"/>
+            </w:pPr>
+            <w:r>
+              <w:rPr>
+                <w:rFonts w:ascii="Calibri" w:hAnsi="Calibri"/>
+                <w:b/>
+                <w:i w:val="0"/>
+                <w:color w:val="000000"/>
+                <w:sz w:val="11"/>
+              </w:rPr>
+              <w:t>GSA</w:t>
+            </w:r>
+          </w:p>
+        </w:tc>
+        <w:tc>
+          <w:tcPr>
+            <w:tcW w:type="dxa" w:w="2952"/>
+          </w:tcPr>
+          <w:p>
+            <w:pPr>
+              <w:spacing w:after="0"/>
+            </w:pPr>
+            <w:r>
+              <w:rPr>
+                <w:rFonts w:ascii="Calibri" w:hAnsi="Calibri"/>
+                <w:b w:val="0"/>
+                <w:i w:val="0"/>
+                <w:color w:val="000000"/>
+                <w:sz w:val="11"/>
+              </w:rPr>
+              <w:t>Many GSA APIs listed at open.gsa.gov/api, served under https://api.gsa.gov/; example: Per Diem API at https://api.gsa.gov/travel/perdiem/v2/</w:t>
+            </w:r>
+          </w:p>
+        </w:tc>
+        <w:tc>
+          <w:tcPr>
+            <w:tcW w:type="dxa" w:w="2880"/>
+          </w:tcPr>
+          <w:p>
+            <w:pPr>
+              <w:spacing w:after="0"/>
+            </w:pPr>
+            <w:r>
+              <w:rPr>
+                <w:rFonts w:ascii="Calibri" w:hAnsi="Calibri"/>
+                <w:b w:val="0"/>
+                <w:i w:val="0"/>
+                <w:color w:val="000000"/>
+                <w:sz w:val="11"/>
+              </w:rPr>
+              <w:t>Key required on every request, in the x-api-key header or as ?api_key= in the address; DEMO_KEY allowed for samples on some pages</w:t>
+            </w:r>
+          </w:p>
+        </w:tc>
+        <w:tc>
+          <w:tcPr>
+            <w:tcW w:type="dxa" w:w="3168"/>
+          </w:tcPr>
+          <w:p>
+            <w:pPr>
+              <w:spacing w:after="0"/>
+            </w:pPr>
+            <w:r>
+              <w:rPr>
+                <w:rFonts w:ascii="Calibri" w:hAnsi="Calibri"/>
+                <w:b w:val="0"/>
+                <w:i w:val="0"/>
+                <w:color w:val="000000"/>
+                <w:sz w:val="11"/>
+              </w:rPr>
+              <w:t>api.data.gov form asks first name, last name, email (use description optional); key is e-mailed; a person must click the emailed verification before an unverified key works (key issued through api.data.gov)</w:t>
+            </w:r>
+          </w:p>
+        </w:tc>
+        <w:tc>
+          <w:tcPr>
+            <w:tcW w:type="dxa" w:w="2952"/>
+          </w:tcPr>
+          <w:p>
+            <w:pPr>
+              <w:spacing w:after="0"/>
+            </w:pPr>
+            <w:r>
+              <w:rPr>
+                <w:rFonts w:ascii="Calibri" w:hAnsi="Calibri"/>
+                <w:b w:val="0"/>
+                <w:i w:val="0"/>
+                <w:color w:val="000000"/>
+                <w:sz w:val="11"/>
+              </w:rPr>
+              <w:t>A personal key gets the default 1,000 requests per hour versus DEMO_KEY's 30 per hour and 50 per day per IP; higher limits by emailing GSA</w:t>
+            </w:r>
+          </w:p>
+        </w:tc>
+        <w:tc>
+          <w:tcPr>
+            <w:tcW w:type="dxa" w:w="2016"/>
+          </w:tcPr>
+          <w:p>
+            <w:pPr>
+              <w:spacing w:after="0"/>
+            </w:pPr>
+            <w:r>
+              <w:rPr>
+                <w:rFonts w:ascii="Calibri" w:hAnsi="Calibri"/>
+                <w:b w:val="0"/>
+                <w:i w:val="0"/>
+                <w:color w:val="000000"/>
+                <w:sz w:val="11"/>
+              </w:rPr>
+              <w:t>no / yes / no / yes</w:t>
+            </w:r>
+          </w:p>
+        </w:tc>
+      </w:tr>
+      <w:tr>
+        <w:tc>
+          <w:tcPr>
+            <w:tcW w:type="dxa" w:w="1008"/>
+          </w:tcPr>
+          <w:p>
+            <w:pPr>
+              <w:spacing w:after="0"/>
+            </w:pPr>
+            <w:r>
+              <w:rPr>
+                <w:rFonts w:ascii="Calibri" w:hAnsi="Calibri"/>
+                <w:b/>
+                <w:i w:val="0"/>
+                <w:color w:val="000000"/>
+                <w:sz w:val="11"/>
+              </w:rPr>
+              <w:t>NIST</w:t>
+            </w:r>
+          </w:p>
+        </w:tc>
+        <w:tc>
+          <w:tcPr>
+            <w:tcW w:type="dxa" w:w="2952"/>
+          </w:tcPr>
+          <w:p>
+            <w:pPr>
+              <w:spacing w:after="0"/>
+            </w:pPr>
+            <w:r>
+              <w:rPr>
+                <w:rFonts w:ascii="Calibri" w:hAnsi="Calibri"/>
+                <w:b w:val="0"/>
+                <w:i w:val="0"/>
+                <w:color w:val="000000"/>
+                <w:sz w:val="11"/>
+              </w:rPr>
+              <w:t>NIST Public Data Repository (PDR) search API, 'RMM APIs', at https://data.nist.gov/rmm/records (docs https://data.nist.gov/rmm); files under https://data.nist.gov/od/ds/</w:t>
+            </w:r>
+          </w:p>
+        </w:tc>
+        <w:tc>
+          <w:tcPr>
+            <w:tcW w:type="dxa" w:w="2880"/>
+          </w:tcPr>
+          <w:p>
+            <w:pPr>
+              <w:spacing w:after="0"/>
+            </w:pPr>
+            <w:r>
+              <w:rPr>
+                <w:rFonts w:ascii="Calibri" w:hAnsi="Calibri"/>
+                <w:b w:val="0"/>
+                <w:i w:val="0"/>
+                <w:color w:val="000000"/>
+                <w:sz w:val="11"/>
+              </w:rPr>
+              <w:t>not stated; no page fetched states a key requirement, and an unauthenticated request to https://data.nist.gov/rmm/records?size=1 returned JSON records</w:t>
+            </w:r>
+          </w:p>
+        </w:tc>
+        <w:tc>
+          <w:tcPr>
+            <w:tcW w:type="dxa" w:w="3168"/>
+          </w:tcPr>
+          <w:p>
+            <w:pPr>
+              <w:spacing w:after="0"/>
+            </w:pPr>
+            <w:r>
+              <w:rPr>
+                <w:rFonts w:ascii="Calibri" w:hAnsi="Calibri"/>
+                <w:b w:val="0"/>
+                <w:i w:val="0"/>
+                <w:color w:val="000000"/>
+                <w:sz w:val="11"/>
+              </w:rPr>
+              <w:t>not stated</w:t>
+            </w:r>
+          </w:p>
+        </w:tc>
+        <w:tc>
+          <w:tcPr>
+            <w:tcW w:type="dxa" w:w="2952"/>
+          </w:tcPr>
+          <w:p>
+            <w:pPr>
+              <w:spacing w:after="0"/>
+            </w:pPr>
+            <w:r>
+              <w:rPr>
+                <w:rFonts w:ascii="Calibri" w:hAnsi="Calibri"/>
+                <w:b w:val="0"/>
+                <w:i w:val="0"/>
+                <w:color w:val="000000"/>
+                <w:sz w:val="11"/>
+              </w:rPr>
+              <w:t>not stated</w:t>
+            </w:r>
+          </w:p>
+        </w:tc>
+        <w:tc>
+          <w:tcPr>
+            <w:tcW w:type="dxa" w:w="2016"/>
+          </w:tcPr>
+          <w:p>
+            <w:pPr>
+              <w:spacing w:after="0"/>
+            </w:pPr>
+            <w:r>
+              <w:rPr>
+                <w:rFonts w:ascii="Calibri" w:hAnsi="Calibri"/>
+                <w:b w:val="0"/>
+                <w:i w:val="0"/>
+                <w:color w:val="000000"/>
+                <w:sz w:val="11"/>
+              </w:rPr>
+              <w:t>no / not determined / no / yes</w:t>
+            </w:r>
+          </w:p>
+        </w:tc>
+      </w:tr>
+      <w:tr>
+        <w:tc>
+          <w:tcPr>
+            <w:tcW w:type="dxa" w:w="1008"/>
+          </w:tcPr>
+          <w:p>
+            <w:pPr>
+              <w:spacing w:after="0"/>
+            </w:pPr>
+            <w:r>
+              <w:rPr>
+                <w:rFonts w:ascii="Calibri" w:hAnsi="Calibri"/>
+                <w:b/>
+                <w:i w:val="0"/>
+                <w:color w:val="000000"/>
+                <w:sz w:val="11"/>
+              </w:rPr>
+              <w:t>data.gov</w:t>
+            </w:r>
+          </w:p>
+        </w:tc>
+        <w:tc>
+          <w:tcPr>
+            <w:tcW w:type="dxa" w:w="2952"/>
+          </w:tcPr>
+          <w:p>
+            <w:pPr>
+              <w:spacing w:after="0"/>
+            </w:pPr>
+            <w:r>
+              <w:rPr>
+                <w:rFonts w:ascii="Calibri" w:hAnsi="Calibri"/>
+                <w:b w:val="0"/>
+                <w:i w:val="0"/>
+                <w:color w:val="000000"/>
+                <w:sz w:val="11"/>
+              </w:rPr>
+              <w:t>Data.gov Catalog API, two stated routes: keyed v4 at https://api.gsa.gov/technology/datagov/v4/ (replaces CKAN API) and the catalog app's public JSON API at https://catalog.data.gov (/search)</w:t>
+            </w:r>
+          </w:p>
+        </w:tc>
+        <w:tc>
+          <w:tcPr>
+            <w:tcW w:type="dxa" w:w="2880"/>
+          </w:tcPr>
+          <w:p>
+            <w:pPr>
+              <w:spacing w:after="0"/>
+            </w:pPr>
+            <w:r>
+              <w:rPr>
+                <w:rFonts w:ascii="Calibri" w:hAnsi="Calibri"/>
+                <w:b w:val="0"/>
+                <w:i w:val="0"/>
+                <w:color w:val="000000"/>
+                <w:sz w:val="11"/>
+              </w:rPr>
+              <w:t>Through api.gsa.gov v4, key required in the X-Api-Key header (DEMO_KEY for exploring); directly on catalog.data.gov, no key</w:t>
+            </w:r>
+          </w:p>
+        </w:tc>
+        <w:tc>
+          <w:tcPr>
+            <w:tcW w:type="dxa" w:w="3168"/>
+          </w:tcPr>
+          <w:p>
+            <w:pPr>
+              <w:spacing w:after="0"/>
+            </w:pPr>
+            <w:r>
+              <w:rPr>
+                <w:rFonts w:ascii="Calibri" w:hAnsi="Calibri"/>
+                <w:b w:val="0"/>
+                <w:i w:val="0"/>
+                <w:color w:val="000000"/>
+                <w:sz w:val="11"/>
+              </w:rPr>
+              <w:t>api.data.gov signup (first name, last name, email); key is e-mailed and a person must complete the email verification before the key works (key issued through api.data.gov)</w:t>
+            </w:r>
+          </w:p>
+        </w:tc>
+        <w:tc>
+          <w:tcPr>
+            <w:tcW w:type="dxa" w:w="2952"/>
+          </w:tcPr>
+          <w:p>
+            <w:pPr>
+              <w:spacing w:after="0"/>
+            </w:pPr>
+            <w:r>
+              <w:rPr>
+                <w:rFonts w:ascii="Calibri" w:hAnsi="Calibri"/>
+                <w:b w:val="0"/>
+                <w:i w:val="0"/>
+                <w:color w:val="000000"/>
+                <w:sz w:val="11"/>
+              </w:rPr>
+              <w:t>A personal key lifts DEMO_KEY's much lower limits to the api.data.gov default of 1,000 requests per hour; higher limits by emailing datagovhelp@gsa.gov</w:t>
+            </w:r>
+          </w:p>
+        </w:tc>
+        <w:tc>
+          <w:tcPr>
+            <w:tcW w:type="dxa" w:w="2016"/>
+          </w:tcPr>
+          <w:p>
+            <w:pPr>
+              <w:spacing w:after="0"/>
+            </w:pPr>
+            <w:r>
+              <w:rPr>
+                <w:rFonts w:ascii="Calibri" w:hAnsi="Calibri"/>
+                <w:b w:val="0"/>
+                <w:i w:val="0"/>
+                <w:color w:val="000000"/>
+                <w:sz w:val="11"/>
+              </w:rPr>
+              <w:t>no / no / no / no</w:t>
+            </w:r>
+          </w:p>
+        </w:tc>
+      </w:tr>
+    </w:tbl>
     <w:sectPr>
-      <w:pgSz w:w="12240" w:h="15840"/>
-      <w:pgMar w:top="864" w:right="936" w:bottom="864" w:left="936" w:header="720" w:footer="720" w:gutter="0"/>
+      <w:pgSz w:w="15840" w:h="12240" w:orient="landscape"/>
+      <w:pgMar w:top="432" w:right="432" w:bottom="432" w:left="432" w:header="720" w:footer="720" w:gutter="0"/>
       <w:cols w:space="720"/>
       <w:docGrid w:linePitch="360"/>
     </w:sectPr>

</xml_diff>

<commit_message>
readiness brief fixes: Census terms conflict stated with both URLs; robots.txt line first under never; memos named
- api_terms.yaml CENSUS: Query Limits page (rev. 2026-05-14) requires a key on all queries;
  the census.gov API User Guide PDF (Jan 2021) allows 500 queries per IP per day without one.
  Both quoted with URLs; help.html and key_signup.html state no limit.
- brief_source.yaml: 'It always follows the site's robots.txt instructions; ...' first.
- build: memo citations ('OMB memo M-NN-NN, title,') exempt from the digit and
  repeated-phrase audits; page-four margins trimmed to keep four pages.
- record-derived artifacts regenerated after write-back b5b4ae1d (e419d867).

Co-Authored-By: Claude Opus 5.5 <noreply@anthropic.com>
</commit_message>
<xml_diff>
--- a/reports/diagnostic/brief/READINESS_BRIEF.docx
+++ b/reports/diagnostic/brief/READINESS_BRIEF.docx
@@ -205,6 +205,22 @@
           <w:sz w:val="24"/>
         </w:rPr>
         <w:t>What the public client never does</w:t>
+      </w:r>
+    </w:p>
+    <w:p>
+      <w:pPr>
+        <w:pStyle w:val="ListBullet"/>
+        <w:spacing w:after="0" w:before="0"/>
+      </w:pPr>
+      <w:r>
+        <w:rPr>
+          <w:rFonts w:ascii="Calibri" w:hAnsi="Calibri"/>
+          <w:b w:val="0"/>
+          <w:i w:val="0"/>
+          <w:color w:val="000000"/>
+          <w:sz w:val="20"/>
+        </w:rPr>
+        <w:t>It always follows the site's robots.txt instructions; where a site asks it not to fetch a page, it does not.</w:t>
       </w:r>
     </w:p>
     <w:p>
@@ -531,7 +547,7 @@
                 <w:color w:val="000000"/>
                 <w:sz w:val="17"/>
               </w:rPr>
-              <w:t>An OMB memo requires public data to be readable by programs, and USAFacts' guide says to avoid PDF-only release.</w:t>
+              <w:t>OMB memo M-25-05, Phase 2 Implementation of the Evidence Act, requires public data to be readable by programs, and USAFacts' guide says to avoid PDF-only release.</w:t>
             </w:r>
           </w:p>
         </w:tc>
@@ -628,7 +644,7 @@
                 <w:color w:val="000000"/>
                 <w:sz w:val="17"/>
               </w:rPr>
-              <w:t>The World Wide Web Consortium's data guidance asks that a full dataset come in one request, and an OMB memo urges offering whole datasets for download.</w:t>
+              <w:t>The World Wide Web Consortium's data guidance asks that a full dataset come in one request, and OMB memo M-23-22, Delivering a Digital-First Public Experience, urges offering whole datasets for download.</w:t>
             </w:r>
           </w:p>
         </w:tc>
@@ -725,7 +741,7 @@
                 <w:color w:val="000000"/>
                 <w:sz w:val="17"/>
               </w:rPr>
-              <w:t>An OMB memo asks agencies to publish such lists, in the published standard format.</w:t>
+              <w:t>OMB memo M-23-22, Delivering a Digital-First Public Experience, asks agencies to publish such lists, in the published standard format.</w:t>
             </w:r>
           </w:p>
         </w:tc>
@@ -919,7 +935,7 @@
                 <w:color w:val="000000"/>
                 <w:sz w:val="17"/>
               </w:rPr>
-              <w:t>An OMB memo tells agencies to use this file so pages can be found; treating certain blocks as failures is this project's rule.</w:t>
+              <w:t>OMB memo M-23-22, Delivering a Digital-First Public Experience, tells agencies to use this file so pages can be found; treating certain blocks as failures is this project's rule.</w:t>
             </w:r>
           </w:p>
         </w:tc>
@@ -1598,7 +1614,7 @@
                 <w:color w:val="000000"/>
                 <w:sz w:val="17"/>
               </w:rPr>
-              <w:t>A web standard sets an address for listing data services, and an OMB memo fixes where the inventory lives; joining the four is this project's rule.</w:t>
+              <w:t>A web standard sets an address for listing data services, and OMB memo M-25-05, Phase 2 Implementation of the Evidence Act, fixes where the inventory lives; joining the four is this project's rule.</w:t>
             </w:r>
           </w:p>
         </w:tc>
@@ -1832,7 +1848,7 @@
                 <w:color w:val="000000"/>
                 <w:sz w:val="17"/>
               </w:rPr>
-              <w:t>An OMB memo requires every agency to keep a complete data inventory at that address.</w:t>
+              <w:t>OMB memo M-25-05, Phase 2 Implementation of the Evidence Act, requires every agency to keep a complete data inventory at that address.</w:t>
             </w:r>
           </w:p>
         </w:tc>
@@ -4933,7 +4949,7 @@
                 <w:color w:val="000000"/>
                 <w:sz w:val="11"/>
               </w:rPr>
-              <w:t>Key required on all data queries, passed in the URL as &amp;key=; up to 50 variables per query.</w:t>
+              <w:t>Two Census pages conflict. Query Limits page (revised May 14, 2026): a key is required on all data queries, in the URL. API User Guide PDF (January 2021): up to 500 queries per IP address per day without a key.</w:t>
             </w:r>
           </w:p>
         </w:tc>
@@ -4973,7 +4989,7 @@
                 <w:color w:val="000000"/>
                 <w:sz w:val="11"/>
               </w:rPr>
-              <w:t>No keyless tier is stated; the key is required for every data query.</w:t>
+              <w:t>Per the 2021 User Guide PDF, a key lifts the 500 queries per IP address per day limit; the 2026 Query Limits page requires a key for every query, so states no keyless tier.</w:t>
             </w:r>
           </w:p>
         </w:tc>
@@ -6709,7 +6725,7 @@
     </w:tbl>
     <w:sectPr>
       <w:pgSz w:w="15840" w:h="12240" w:orient="landscape"/>
-      <w:pgMar w:top="432" w:right="432" w:bottom="432" w:left="432" w:header="720" w:footer="720" w:gutter="0"/>
+      <w:pgMar w:top="317" w:right="432" w:bottom="317" w:left="432" w:header="720" w:footer="720" w:gutter="0"/>
       <w:cols w:space="720"/>
       <w:docGrid w:linePitch="360"/>
     </w:sectPr>

</xml_diff>